<commit_message>
Add confidential editor assessment
</commit_message>
<xml_diff>
--- a/manuscript/reviewer_report_JTM.docx
+++ b/manuscript/reviewer_report_JTM.docx
@@ -199,7 +199,397 @@
           <w:color w:val="000000"/>
           <w:sz w:val="22"/>
         </w:rPr>
-        <w:t>The manuscript fits the Molecular Pathology remit as a reproducible study of image-derived molecular and derived immune-feature signals in human tumours. Its main contribution is a transparent endpoint-by-endpoint benchmark using a fixed pretrained representation, complete negative reporting and portable fitted linear models. The authors appropriately refrain from clinical claims and label every value as an internally derived TCGA estimate. Without an independent cohort, the work should be evaluated as a computational pathology resource rather than a translational prediction study.</w:t>
+        <w:t>The manuscript is unusually transparent and technically better controlled than many large TCGA prediction screens. Patient-level pooling, nested validation, explicit negative-result reporting and target-level sensitivity to grouping by TCGA tissue-source-site code are important strengths.</w:t>
+      </w:r>
+    </w:p>
+    <w:p>
+      <w:pPr>
+        <w:spacing w:after="120" w:line="264" w:lineRule="auto"/>
+      </w:pPr>
+      <w:r>
+        <w:rPr>
+          <w:rFonts w:ascii="Calibri" w:hAnsi="Calibri"/>
+          <w:b w:val="0"/>
+          <w:i w:val="0"/>
+          <w:color w:val="000000"/>
+          <w:sz w:val="22"/>
+        </w:rPr>
+        <w:t>However, it remains an internally validated TCGA benchmark whose mutation results substantially overlap the existing literature. The most compelling contribution is the unified analysis and reusable model infrastructure rather than novel biomarker discovery. The lack of external validation is particularly important for a translational journal, and the collapse of several leading results under grouping by TCGA tissue-source-site code reinforces this concern.</w:t>
+      </w:r>
+    </w:p>
+    <w:p>
+      <w:pPr>
+        <w:spacing w:after="120" w:line="264" w:lineRule="auto"/>
+      </w:pPr>
+      <w:r>
+        <w:rPr>
+          <w:rFonts w:ascii="Calibri" w:hAnsi="Calibri"/>
+          <w:b w:val="0"/>
+          <w:i w:val="0"/>
+          <w:color w:val="000000"/>
+          <w:sz w:val="22"/>
+        </w:rPr>
+        <w:t>I would support major revision only if the authors can resolve the TITAN-derived fitted-model redistribution/licensing question and materially strengthen transportability evidence, preferably through locked external validation. The current private, access-controlled status of TITANPred avoids an unsupported public-redistribution claim but does not itself constitute definitive licensing clearance. Without those changes, I would recommend rejection with encouragement to transfer the work to a computational pathology, bioinformatics or research-resource venue.</w:t>
+      </w:r>
+    </w:p>
+    <w:p>
+      <w:pPr>
+        <w:pStyle w:val="Heading2"/>
+        <w:keepNext/>
+      </w:pPr>
+      <w:r>
+        <w:t>Summary judgement</w:t>
+      </w:r>
+    </w:p>
+    <w:tbl>
+      <w:tblPr>
+        <w:tblStyle w:val="TableGrid"/>
+        <w:tblW w:type="auto" w:w="0"/>
+        <w:tblLayout w:type="autofit"/>
+        <w:tblLook w:firstColumn="1" w:firstRow="1" w:lastColumn="0" w:lastRow="0" w:noHBand="0" w:noVBand="1" w:val="04A0"/>
+      </w:tblPr>
+      <w:tblGrid>
+        <w:gridCol w:w="4680"/>
+        <w:gridCol w:w="4680"/>
+      </w:tblGrid>
+      <w:tr>
+        <w:tc>
+          <w:tcPr>
+            <w:tcW w:type="dxa" w:w="4680"/>
+          </w:tcPr>
+          <w:p>
+            <w:r>
+              <w:rPr>
+                <w:rFonts w:ascii="Calibri" w:hAnsi="Calibri"/>
+                <w:b/>
+                <w:i w:val="0"/>
+                <w:color w:val="1F4D78"/>
+                <w:sz w:val="22"/>
+              </w:rPr>
+              <w:t>Criterion</w:t>
+            </w:r>
+          </w:p>
+        </w:tc>
+        <w:tc>
+          <w:tcPr>
+            <w:tcW w:type="dxa" w:w="4680"/>
+          </w:tcPr>
+          <w:p>
+            <w:r>
+              <w:rPr>
+                <w:rFonts w:ascii="Calibri" w:hAnsi="Calibri"/>
+                <w:b/>
+                <w:i w:val="0"/>
+                <w:color w:val="1F4D78"/>
+                <w:sz w:val="22"/>
+              </w:rPr>
+              <w:t>Assessment</w:t>
+            </w:r>
+          </w:p>
+        </w:tc>
+      </w:tr>
+      <w:tr>
+        <w:tc>
+          <w:tcPr>
+            <w:tcW w:type="dxa" w:w="4680"/>
+          </w:tcPr>
+          <w:p>
+            <w:r>
+              <w:rPr>
+                <w:rFonts w:ascii="Calibri" w:hAnsi="Calibri"/>
+                <w:b/>
+                <w:i w:val="0"/>
+                <w:color w:val="000000"/>
+                <w:sz w:val="22"/>
+              </w:rPr>
+              <w:t>Scientific question</w:t>
+            </w:r>
+          </w:p>
+        </w:tc>
+        <w:tc>
+          <w:tcPr>
+            <w:tcW w:type="dxa" w:w="4680"/>
+          </w:tcPr>
+          <w:p>
+            <w:r>
+              <w:rPr>
+                <w:rFonts w:ascii="Calibri" w:hAnsi="Calibri"/>
+                <w:b w:val="0"/>
+                <w:i w:val="0"/>
+                <w:color w:val="000000"/>
+                <w:sz w:val="22"/>
+              </w:rPr>
+              <w:t>Important and timely</w:t>
+            </w:r>
+          </w:p>
+        </w:tc>
+      </w:tr>
+      <w:tr>
+        <w:tc>
+          <w:tcPr>
+            <w:tcW w:type="dxa" w:w="4680"/>
+          </w:tcPr>
+          <w:p>
+            <w:r>
+              <w:rPr>
+                <w:rFonts w:ascii="Calibri" w:hAnsi="Calibri"/>
+                <w:b/>
+                <w:i w:val="0"/>
+                <w:color w:val="000000"/>
+                <w:sz w:val="22"/>
+              </w:rPr>
+              <w:t>Technical execution</w:t>
+            </w:r>
+          </w:p>
+        </w:tc>
+        <w:tc>
+          <w:tcPr>
+            <w:tcW w:type="dxa" w:w="4680"/>
+          </w:tcPr>
+          <w:p>
+            <w:r>
+              <w:rPr>
+                <w:rFonts w:ascii="Calibri" w:hAnsi="Calibri"/>
+                <w:b w:val="0"/>
+                <w:i w:val="0"/>
+                <w:color w:val="000000"/>
+                <w:sz w:val="22"/>
+              </w:rPr>
+              <w:t>Generally strong, with important statistical issues</w:t>
+            </w:r>
+          </w:p>
+        </w:tc>
+      </w:tr>
+      <w:tr>
+        <w:tc>
+          <w:tcPr>
+            <w:tcW w:type="dxa" w:w="4680"/>
+          </w:tcPr>
+          <w:p>
+            <w:r>
+              <w:rPr>
+                <w:rFonts w:ascii="Calibri" w:hAnsi="Calibri"/>
+                <w:b/>
+                <w:i w:val="0"/>
+                <w:color w:val="000000"/>
+                <w:sz w:val="22"/>
+              </w:rPr>
+              <w:t>Transparency and reproducibility</w:t>
+            </w:r>
+          </w:p>
+        </w:tc>
+        <w:tc>
+          <w:tcPr>
+            <w:tcW w:type="dxa" w:w="4680"/>
+          </w:tcPr>
+          <w:p>
+            <w:r>
+              <w:rPr>
+                <w:rFonts w:ascii="Calibri" w:hAnsi="Calibri"/>
+                <w:b w:val="0"/>
+                <w:i w:val="0"/>
+                <w:color w:val="000000"/>
+                <w:sz w:val="22"/>
+              </w:rPr>
+              <w:t>Very strong</w:t>
+            </w:r>
+          </w:p>
+        </w:tc>
+      </w:tr>
+      <w:tr>
+        <w:tc>
+          <w:tcPr>
+            <w:tcW w:type="dxa" w:w="4680"/>
+          </w:tcPr>
+          <w:p>
+            <w:r>
+              <w:rPr>
+                <w:rFonts w:ascii="Calibri" w:hAnsi="Calibri"/>
+                <w:b/>
+                <w:i w:val="0"/>
+                <w:color w:val="000000"/>
+                <w:sz w:val="22"/>
+              </w:rPr>
+              <w:t>Novelty</w:t>
+            </w:r>
+          </w:p>
+        </w:tc>
+        <w:tc>
+          <w:tcPr>
+            <w:tcW w:type="dxa" w:w="4680"/>
+          </w:tcPr>
+          <w:p>
+            <w:r>
+              <w:rPr>
+                <w:rFonts w:ascii="Calibri" w:hAnsi="Calibri"/>
+                <w:b w:val="0"/>
+                <w:i w:val="0"/>
+                <w:color w:val="000000"/>
+                <w:sz w:val="22"/>
+              </w:rPr>
+              <w:t>Moderate; mainly framework/resource novelty</w:t>
+            </w:r>
+          </w:p>
+        </w:tc>
+      </w:tr>
+      <w:tr>
+        <w:tc>
+          <w:tcPr>
+            <w:tcW w:type="dxa" w:w="4680"/>
+          </w:tcPr>
+          <w:p>
+            <w:r>
+              <w:rPr>
+                <w:rFonts w:ascii="Calibri" w:hAnsi="Calibri"/>
+                <w:b/>
+                <w:i w:val="0"/>
+                <w:color w:val="000000"/>
+                <w:sz w:val="22"/>
+              </w:rPr>
+              <w:t>Biological interpretation</w:t>
+            </w:r>
+          </w:p>
+        </w:tc>
+        <w:tc>
+          <w:tcPr>
+            <w:tcW w:type="dxa" w:w="4680"/>
+          </w:tcPr>
+          <w:p>
+            <w:r>
+              <w:rPr>
+                <w:rFonts w:ascii="Calibri" w:hAnsi="Calibri"/>
+                <w:b w:val="0"/>
+                <w:i w:val="0"/>
+                <w:color w:val="000000"/>
+                <w:sz w:val="22"/>
+              </w:rPr>
+              <w:t>Limited</w:t>
+            </w:r>
+          </w:p>
+        </w:tc>
+      </w:tr>
+      <w:tr>
+        <w:tc>
+          <w:tcPr>
+            <w:tcW w:type="dxa" w:w="4680"/>
+          </w:tcPr>
+          <w:p>
+            <w:r>
+              <w:rPr>
+                <w:rFonts w:ascii="Calibri" w:hAnsi="Calibri"/>
+                <w:b/>
+                <w:i w:val="0"/>
+                <w:color w:val="000000"/>
+                <w:sz w:val="22"/>
+              </w:rPr>
+              <w:t>External/translational validation</w:t>
+            </w:r>
+          </w:p>
+        </w:tc>
+        <w:tc>
+          <w:tcPr>
+            <w:tcW w:type="dxa" w:w="4680"/>
+          </w:tcPr>
+          <w:p>
+            <w:r>
+              <w:rPr>
+                <w:rFonts w:ascii="Calibri" w:hAnsi="Calibri"/>
+                <w:b w:val="0"/>
+                <w:i w:val="0"/>
+                <w:color w:val="000000"/>
+                <w:sz w:val="22"/>
+              </w:rPr>
+              <w:t>Insufficient</w:t>
+            </w:r>
+          </w:p>
+        </w:tc>
+      </w:tr>
+      <w:tr>
+        <w:tc>
+          <w:tcPr>
+            <w:tcW w:type="dxa" w:w="4680"/>
+          </w:tcPr>
+          <w:p>
+            <w:r>
+              <w:rPr>
+                <w:rFonts w:ascii="Calibri" w:hAnsi="Calibri"/>
+                <w:b/>
+                <w:i w:val="0"/>
+                <w:color w:val="000000"/>
+                <w:sz w:val="22"/>
+              </w:rPr>
+              <w:t>Presentation</w:t>
+            </w:r>
+          </w:p>
+        </w:tc>
+        <w:tc>
+          <w:tcPr>
+            <w:tcW w:type="dxa" w:w="4680"/>
+          </w:tcPr>
+          <w:p>
+            <w:r>
+              <w:rPr>
+                <w:rFonts w:ascii="Calibri" w:hAnsi="Calibri"/>
+                <w:b w:val="0"/>
+                <w:i w:val="0"/>
+                <w:color w:val="000000"/>
+                <w:sz w:val="22"/>
+              </w:rPr>
+              <w:t>Clear but overly dense</w:t>
+            </w:r>
+          </w:p>
+        </w:tc>
+      </w:tr>
+      <w:tr>
+        <w:tc>
+          <w:tcPr>
+            <w:tcW w:type="dxa" w:w="4680"/>
+          </w:tcPr>
+          <w:p>
+            <w:r>
+              <w:rPr>
+                <w:rFonts w:ascii="Calibri" w:hAnsi="Calibri"/>
+                <w:b/>
+                <w:i w:val="0"/>
+                <w:color w:val="000000"/>
+                <w:sz w:val="22"/>
+              </w:rPr>
+              <w:t>Current decision</w:t>
+            </w:r>
+          </w:p>
+        </w:tc>
+        <w:tc>
+          <w:tcPr>
+            <w:tcW w:type="dxa" w:w="4680"/>
+          </w:tcPr>
+          <w:p>
+            <w:r>
+              <w:rPr>
+                <w:rFonts w:ascii="Calibri" w:hAnsi="Calibri"/>
+                <w:b/>
+                <w:i w:val="0"/>
+                <w:color w:val="000000"/>
+                <w:sz w:val="22"/>
+              </w:rPr>
+              <w:t>Major revision</w:t>
+            </w:r>
+          </w:p>
+        </w:tc>
+      </w:tr>
+    </w:tbl>
+    <w:p>
+      <w:pPr>
+        <w:spacing w:after="120" w:line="264" w:lineRule="auto"/>
+      </w:pPr>
+      <w:r>
+        <w:rPr>
+          <w:rFonts w:ascii="Calibri" w:hAnsi="Calibri"/>
+          <w:b w:val="0"/>
+          <w:i w:val="0"/>
+          <w:color w:val="000000"/>
+          <w:sz w:val="22"/>
+        </w:rPr>
+        <w:t>The manuscript has a strong publishable core, but the next revision should be organised around four priorities: independent validation, reporting of robustness to grouping by TCGA tissue-source-site code, a fair modelling comparison, and definitive licensing clearance.</w:t>
       </w:r>
     </w:p>
     <w:p>

</xml_diff>